<commit_message>
Level the instrument drawings, each by its own tilt
The supplied drawings are slightly tilted, so the neck ran downhill:
0.63 degrees on the guitar, 0.09 on the bass. The extractor now fits a
line through the middle of each fretboard and rotates that whole
drawing about its nut by its own angle, every part through one
transform. The neck's centre line is flat to within 0.02 of a unit on
both instruments, and the small neck map is horizontal with it.

The files in reference/ are untouched; the rotation is applied when
artwork.ts is generated. 277 tests pass.

Co-Authored-By: Claude Opus 5.5 <noreply@anthropic.com>
</commit_message>
<xml_diff>
--- a/docs/FretLab-report.docx
+++ b/docs/FretLab-report.docx
@@ -680,6 +680,58 @@
       </w:r>
       <w:r>
         <w:t xml:space="preserve">it against either end carries the view on to the headstock or the body.</w:t>
+      </w:r>
+    </w:p>
+    <w:p>
+      <w:pPr>
+        <w:pStyle w:val="Compact"/>
+        <w:numPr>
+          <w:ilvl w:val="0"/>
+          <w:numId w:val="1001"/>
+        </w:numPr>
+      </w:pPr>
+      <w:r>
+        <w:rPr>
+          <w:b/>
+          <w:bCs/>
+        </w:rPr>
+        <w:t xml:space="preserve">The instrument drawings are levelled.</w:t>
+      </w:r>
+      <w:r>
+        <w:t xml:space="preserve"> </w:t>
+      </w:r>
+      <w:r>
+        <w:t xml:space="preserve">The supplied drawings are each</w:t>
+      </w:r>
+      <w:r>
+        <w:t xml:space="preserve"> </w:t>
+      </w:r>
+      <w:r>
+        <w:t xml:space="preserve">slightly tilted, so the neck ran downhill: by 0.63° on the guitar, about</w:t>
+      </w:r>
+      <w:r>
+        <w:t xml:space="preserve"> </w:t>
+      </w:r>
+      <w:r>
+        <w:t xml:space="preserve">seven units from nut to body, and by 0.09° on the bass. The extractor now fits</w:t>
+      </w:r>
+      <w:r>
+        <w:t xml:space="preserve"> </w:t>
+      </w:r>
+      <w:r>
+        <w:t xml:space="preserve">a line through the middle of each fretboard and rotates that whole drawing</w:t>
+      </w:r>
+      <w:r>
+        <w:t xml:space="preserve"> </w:t>
+      </w:r>
+      <w:r>
+        <w:t xml:space="preserve">about its nut by its own angle, every part through the same transform. The</w:t>
+      </w:r>
+      <w:r>
+        <w:t xml:space="preserve"> </w:t>
+      </w:r>
+      <w:r>
+        <w:t xml:space="preserve">neck’s centre line is flat to within 0.02 of a unit on both instruments.</w:t>
       </w:r>
     </w:p>
     <w:p>

</xml_diff>

<commit_message>
Level the reference SVGs themselves; leave the logo as drawn
Every SVG in each instrument's folder, the whole drawing and each part,
is turned by that instrument's own tilt (0.634 degrees for the guitar,
0.089 for the bass). The contents are wrapped in one rotation rather
than rewritten, and the viewBox widened just enough to hold them, so
the parts still fit together. tools/level-reference.mjs did it and
skips files already levelled. The necks now measure level to a
thousandth of a degree.

The headstock logo is no longer turned the right way up: it is upside
down in the drawings on purpose.

Co-Authored-By: Claude Opus 5.5 <noreply@anthropic.com>
</commit_message>
<xml_diff>
--- a/docs/FretLab-report.docx
+++ b/docs/FretLab-report.docx
@@ -701,7 +701,7 @@
         <w:t xml:space="preserve"> </w:t>
       </w:r>
       <w:r>
-        <w:t xml:space="preserve">The supplied drawings are each</w:t>
+        <w:t xml:space="preserve">The supplied drawings were each</w:t>
       </w:r>
       <w:r>
         <w:t xml:space="preserve"> </w:t>
@@ -713,25 +713,59 @@
         <w:t xml:space="preserve"> </w:t>
       </w:r>
       <w:r>
-        <w:t xml:space="preserve">seven units from nut to body, and by 0.09° on the bass. The extractor now fits</w:t>
-      </w:r>
-      <w:r>
-        <w:t xml:space="preserve"> </w:t>
-      </w:r>
-      <w:r>
-        <w:t xml:space="preserve">a line through the middle of each fretboard and rotates that whole drawing</w:t>
-      </w:r>
-      <w:r>
-        <w:t xml:space="preserve"> </w:t>
-      </w:r>
-      <w:r>
-        <w:t xml:space="preserve">about its nut by its own angle, every part through the same transform. The</w:t>
-      </w:r>
-      <w:r>
-        <w:t xml:space="preserve"> </w:t>
-      </w:r>
-      <w:r>
-        <w:t xml:space="preserve">neck’s centre line is flat to within 0.02 of a unit on both instruments.</w:t>
+        <w:t xml:space="preserve">seven units from nut to body, and by 0.09° on the bass. Every SVG in each</w:t>
+      </w:r>
+      <w:r>
+        <w:t xml:space="preserve"> </w:t>
+      </w:r>
+      <w:r>
+        <w:t xml:space="preserve">instrument’s folder — the whole drawing and each part — has been turned by</w:t>
+      </w:r>
+      <w:r>
+        <w:t xml:space="preserve"> </w:t>
+      </w:r>
+      <w:r>
+        <w:t xml:space="preserve">that instrument’s own angle, by wrapping its contents in a single rotation</w:t>
+      </w:r>
+      <w:r>
+        <w:t xml:space="preserve"> </w:t>
+      </w:r>
+      <w:r>
+        <w:t xml:space="preserve">rather than rewriting them, so the parts still fit together exactly. The</w:t>
+      </w:r>
+      <w:r>
+        <w:t xml:space="preserve"> </w:t>
+      </w:r>
+      <w:r>
+        <w:t xml:space="preserve">necks now measure level to a thousandth of a degree.</w:t>
+      </w:r>
+    </w:p>
+    <w:p>
+      <w:pPr>
+        <w:pStyle w:val="Compact"/>
+        <w:numPr>
+          <w:ilvl w:val="0"/>
+          <w:numId w:val="1001"/>
+        </w:numPr>
+      </w:pPr>
+      <w:r>
+        <w:rPr>
+          <w:b/>
+          <w:bCs/>
+        </w:rPr>
+        <w:t xml:space="preserve">The headstock logo is as drawn.</w:t>
+      </w:r>
+      <w:r>
+        <w:t xml:space="preserve"> </w:t>
+      </w:r>
+      <w:r>
+        <w:t xml:space="preserve">An earlier version turned it the right</w:t>
+      </w:r>
+      <w:r>
+        <w:t xml:space="preserve"> </w:t>
+      </w:r>
+      <w:r>
+        <w:t xml:space="preserve">way up; it is upside down in the drawings on purpose, and is left that way.</w:t>
       </w:r>
     </w:p>
     <w:p>

</xml_diff>